<commit_message>
Revert "permanent IoT quarantine + ML forensic investigation reports"
This reverts commit e8e7612449805964003726e07e9a74cd6bbd9369.
</commit_message>
<xml_diff>
--- a/feature_engineering_rationale.docx
+++ b/feature_engineering_rationale.docx
@@ -93,55 +93,32 @@
           <w:rFonts w:ascii="Arial" w:eastAsia="Arial" w:hAnsi="Arial" w:cs="Arial"/>
           <w:color w:val="555555"/>
         </w:rPr>
-        <w:t xml:space="preserve">Graduation </w:t>
-      </w:r>
-      <w:proofErr w:type="gramStart"/>
+        <w:t>Graduation Project — Computer Engineering</w:t>
+      </w:r>
+    </w:p>
+    <w:p>
+      <w:pPr>
+        <w:spacing w:after="80"/>
+        <w:jc w:val="center"/>
+      </w:pPr>
       <w:r>
         <w:rPr>
           <w:rFonts w:ascii="Arial" w:eastAsia="Arial" w:hAnsi="Arial" w:cs="Arial"/>
           <w:color w:val="555555"/>
         </w:rPr>
-        <w:t xml:space="preserve">Project </w:t>
-      </w:r>
+        <w:t>SDN-Based IoT Intrusion Prevention System</w:t>
+      </w:r>
+    </w:p>
+    <w:p>
+      <w:pPr>
+        <w:jc w:val="center"/>
+      </w:pPr>
       <w:r>
         <w:rPr>
           <w:rFonts w:ascii="Arial" w:eastAsia="Arial" w:hAnsi="Arial" w:cs="Arial"/>
           <w:color w:val="555555"/>
         </w:rPr>
-        <w:t>:</w:t>
-      </w:r>
-      <w:proofErr w:type="gramEnd"/>
-    </w:p>
-    <w:p>
-      <w:pPr>
-        <w:spacing w:after="80"/>
-        <w:jc w:val="center"/>
-      </w:pPr>
-      <w:r>
-        <w:rPr>
-          <w:rFonts w:ascii="Arial" w:eastAsia="Arial" w:hAnsi="Arial" w:cs="Arial"/>
-          <w:color w:val="555555"/>
-        </w:rPr>
-        <w:t>SDN-Based IoT Intrusion Prevention System</w:t>
-      </w:r>
-    </w:p>
-    <w:p>
-      <w:pPr>
-        <w:jc w:val="center"/>
-      </w:pPr>
-      <w:r>
-        <w:rPr>
-          <w:rFonts w:ascii="Arial" w:eastAsia="Arial" w:hAnsi="Arial" w:cs="Arial"/>
-          <w:color w:val="555555"/>
-        </w:rPr>
         <w:t>2025</w:t>
-      </w:r>
-      <w:r>
-        <w:rPr>
-          <w:rFonts w:ascii="Arial" w:eastAsia="Arial" w:hAnsi="Arial" w:cs="Arial"/>
-          <w:color w:val="555555"/>
-        </w:rPr>
-        <w:t xml:space="preserve"> / 2026</w:t>
       </w:r>
     </w:p>
     <w:p>
@@ -880,7 +857,15 @@
       </w:r>
       <w:proofErr w:type="gramEnd"/>
       <w:r>
-        <w:t>state resets at each window boundary. The directionality ratios are computed within the window without any cross-window connection tracking, providing asymmetry information at constant memory cost regardless of flood intensity.</w:t>
+        <w:t xml:space="preserve">state resets at each window boundary. The directionality ratios are computed within the window without any cross-window connection tracking, providing </w:t>
+      </w:r>
+      <w:proofErr w:type="gramStart"/>
+      <w:r>
+        <w:t>asymmetry</w:t>
+      </w:r>
+      <w:proofErr w:type="gramEnd"/>
+      <w:r>
+        <w:t xml:space="preserve"> information at constant memory cost regardless of flood intensity.</w:t>
       </w:r>
     </w:p>
     <w:p>
@@ -1649,7 +1634,21 @@
         <w:rPr>
           <w:color w:val="EE0000"/>
         </w:rPr>
-        <w:t>single flood session are all identical in size</w:t>
+        <w:t xml:space="preserve">single flood </w:t>
+      </w:r>
+      <w:proofErr w:type="gramStart"/>
+      <w:r>
+        <w:rPr>
+          <w:color w:val="EE0000"/>
+        </w:rPr>
+        <w:t>session</w:t>
+      </w:r>
+      <w:proofErr w:type="gramEnd"/>
+      <w:r>
+        <w:rPr>
+          <w:color w:val="EE0000"/>
+        </w:rPr>
+        <w:t xml:space="preserve"> are all identical in size</w:t>
       </w:r>
       <w:r>
         <w:t>. The standard deviation of packet sizes in an attack flow is therefore near zero—often exactly zero if the tool does not randomize sizes.</w:t>
@@ -2468,7 +2467,21 @@
         <w:rPr>
           <w:color w:val="EE0000"/>
         </w:rPr>
-        <w:t>Only the aggregate number of flows from a single source reveals the anomaly.</w:t>
+        <w:t xml:space="preserve">Only the aggregate number of </w:t>
+      </w:r>
+      <w:proofErr w:type="gramStart"/>
+      <w:r>
+        <w:rPr>
+          <w:color w:val="EE0000"/>
+        </w:rPr>
+        <w:t>flows</w:t>
+      </w:r>
+      <w:proofErr w:type="gramEnd"/>
+      <w:r>
+        <w:rPr>
+          <w:color w:val="EE0000"/>
+        </w:rPr>
+        <w:t xml:space="preserve"> from a single source reveals the anomaly.</w:t>
       </w:r>
     </w:p>
     <w:p>
@@ -4410,16 +4423,32 @@
         <w:jc w:val="both"/>
       </w:pPr>
       <w:r>
-        <w:t>The comparison in Table I reveals two feature groups that are unique to this work and absent from both benchmark datasets: the ARP-specific behavioral features and the device behavioral history features. The ARP group is absent from benchmarks because most benchmark datasets are generated on physical networks where ARP spoofing has a distinct network-layer signature, or because the benchmarks focus on network-level rather than host-level attack scenarios. The device behavioral history group is absent because benchmark datasets are typically static snapshots rather than live systems with persistent per-device profiling.</w:t>
-      </w:r>
-    </w:p>
-    <w:p>
-      <w:pPr>
-        <w:spacing w:before="80" w:after="80" w:line="288" w:lineRule="auto"/>
-        <w:jc w:val="both"/>
-      </w:pPr>
-      <w:r>
-        <w:t>The device behavioral history features are particularly significant for zero-day detection. CIC-IDS2017 and UNSW-NB15 train models on absolute feature values—the model learns that a specific PPS value is malicious. The device deviation features in this work train the model on relative deviations from a device's own historical baseline—the model learns that a significant departure from normal behavior is malicious, regardless of the absolute value. This distinction is the mathematical foundation for the claim that the system can detect behavioral anomalies consistent with previously unseen attack patterns.</w:t>
+        <w:t xml:space="preserve">The comparison in Table I reveals two feature groups that are unique to this work and absent from both benchmark datasets: the ARP-specific behavioral features and the device behavioral </w:t>
+      </w:r>
+      <w:proofErr w:type="gramStart"/>
+      <w:r>
+        <w:t>history</w:t>
+      </w:r>
+      <w:proofErr w:type="gramEnd"/>
+      <w:r>
+        <w:t xml:space="preserve"> features. The ARP group is absent from benchmarks because most benchmark datasets are generated on physical networks where ARP spoofing has a distinct network-layer signature, or because the benchmarks focus on network-level rather than host-level attack scenarios. The device behavioral history group is absent because benchmark datasets are typically static snapshots rather than live systems with persistent per-device profiling.</w:t>
+      </w:r>
+    </w:p>
+    <w:p>
+      <w:pPr>
+        <w:spacing w:before="80" w:after="80" w:line="288" w:lineRule="auto"/>
+        <w:jc w:val="both"/>
+      </w:pPr>
+      <w:r>
+        <w:t xml:space="preserve">The device behavioral </w:t>
+      </w:r>
+      <w:proofErr w:type="gramStart"/>
+      <w:r>
+        <w:t>history</w:t>
+      </w:r>
+      <w:proofErr w:type="gramEnd"/>
+      <w:r>
+        <w:t xml:space="preserve"> features are particularly significant for zero-day detection. CIC-IDS2017 and UNSW-NB15 train models on absolute feature values—the model learns that a specific PPS value is malicious. The device deviation features in this work train the model on relative deviations from a device's own historical baseline—the model learns that a significant departure from normal behavior is malicious, regardless of the absolute value. This distinction is the mathematical foundation for the claim that the system can detect behavioral anomalies consistent with previously unseen attack patterns.</w:t>
       </w:r>
     </w:p>
     <w:p>
@@ -5428,48 +5457,6 @@
       <w:szCs w:val="20"/>
     </w:rPr>
   </w:style>
-  <w:style w:type="paragraph" w:styleId="Header">
-    <w:name w:val="header"/>
-    <w:basedOn w:val="Normal"/>
-    <w:link w:val="HeaderChar"/>
-    <w:uiPriority w:val="99"/>
-    <w:unhideWhenUsed/>
-    <w:rsid w:val="00796BFA"/>
-    <w:pPr>
-      <w:tabs>
-        <w:tab w:val="center" w:pos="4680"/>
-        <w:tab w:val="right" w:pos="9360"/>
-      </w:tabs>
-    </w:pPr>
-  </w:style>
-  <w:style w:type="character" w:customStyle="1" w:styleId="HeaderChar">
-    <w:name w:val="Header Char"/>
-    <w:basedOn w:val="DefaultParagraphFont"/>
-    <w:link w:val="Header"/>
-    <w:uiPriority w:val="99"/>
-    <w:rsid w:val="00796BFA"/>
-  </w:style>
-  <w:style w:type="paragraph" w:styleId="Footer">
-    <w:name w:val="footer"/>
-    <w:basedOn w:val="Normal"/>
-    <w:link w:val="FooterChar"/>
-    <w:uiPriority w:val="99"/>
-    <w:unhideWhenUsed/>
-    <w:rsid w:val="00796BFA"/>
-    <w:pPr>
-      <w:tabs>
-        <w:tab w:val="center" w:pos="4680"/>
-        <w:tab w:val="right" w:pos="9360"/>
-      </w:tabs>
-    </w:pPr>
-  </w:style>
-  <w:style w:type="character" w:customStyle="1" w:styleId="FooterChar">
-    <w:name w:val="Footer Char"/>
-    <w:basedOn w:val="DefaultParagraphFont"/>
-    <w:link w:val="Footer"/>
-    <w:uiPriority w:val="99"/>
-    <w:rsid w:val="00796BFA"/>
-  </w:style>
 </w:styles>
 </file>
 

</xml_diff>